<commit_message>
Add RNN and self-learning coursework
Co-authored-by: Copilot <223556219+Copilot@users.noreply.github.com>
</commit_message>
<xml_diff>
--- a/EX_4/EX 4 - TransferLearningUsingPre-TrainedVisionModelsforImageRecognition.docx
+++ b/EX_4/EX 4 - TransferLearningUsingPre-TrainedVisionModelsforImageRecognition.docx
@@ -141,6 +141,34 @@
           <w:b/>
           <w:bCs/>
         </w:rPr>
+        <w:t>Midhun P 24BAD069</w:t>
+      </w:r>
+    </w:p>
+    <w:p>
+      <w:pPr>
+        <w:spacing w:after="0" w:line="240" w:lineRule="auto"/>
+        <w:rPr>
+          <w:rFonts w:ascii="Cambria" w:hAnsi="Cambria"/>
+          <w:b/>
+          <w:bCs/>
+        </w:rPr>
+      </w:pPr>
+    </w:p>
+    <w:p>
+      <w:pPr>
+        <w:spacing w:after="0" w:line="240" w:lineRule="auto"/>
+        <w:rPr>
+          <w:rFonts w:ascii="Cambria" w:hAnsi="Cambria"/>
+          <w:b/>
+          <w:bCs/>
+        </w:rPr>
+      </w:pPr>
+      <w:r>
+        <w:rPr>
+          <w:rFonts w:ascii="Cambria" w:hAnsi="Cambria"/>
+          <w:b/>
+          <w:bCs/>
+        </w:rPr>
         <w:t>PRE-LAB QUESTIONS (PROVIDE BRIEF ANSWERS TO THE FOLLOWING QUESTIONS)</w:t>
       </w:r>
     </w:p>
@@ -603,6 +631,7 @@
         <w:rPr>
           <w:rFonts w:ascii="Cambria" w:hAnsi="Cambria"/>
         </w:rPr>
+        <w:lastRenderedPageBreak/>
         <w:t>GitHub</w:t>
       </w:r>
     </w:p>
@@ -630,7 +659,6 @@
           <w:b/>
           <w:bCs/>
         </w:rPr>
-        <w:lastRenderedPageBreak/>
         <w:t>OBJECTIVES</w:t>
       </w:r>
     </w:p>
@@ -914,6 +942,7 @@
       <w:r>
         <w:rPr>
           <w:rFonts w:ascii="Cambria" w:hAnsi="Cambria"/>
+          <w:noProof/>
         </w:rPr>
         <w:drawing>
           <wp:inline distT="0" distB="0" distL="0" distR="0" wp14:anchorId="2322796C" wp14:editId="31A3755B">
@@ -931,7 +960,7 @@
                     <pic:cNvPicPr/>
                   </pic:nvPicPr>
                   <pic:blipFill>
-                    <a:blip r:embed="rId8"/>
+                    <a:blip r:embed="rId10"/>
                     <a:stretch>
                       <a:fillRect/>
                     </a:stretch>
@@ -970,6 +999,7 @@
       <w:r>
         <w:rPr>
           <w:rFonts w:ascii="Cambria" w:hAnsi="Cambria"/>
+          <w:noProof/>
         </w:rPr>
         <w:lastRenderedPageBreak/>
         <w:drawing>
@@ -988,7 +1018,7 @@
                     <pic:cNvPicPr/>
                   </pic:nvPicPr>
                   <pic:blipFill>
-                    <a:blip r:embed="rId9"/>
+                    <a:blip r:embed="rId11"/>
                     <a:stretch>
                       <a:fillRect/>
                     </a:stretch>
@@ -1019,6 +1049,7 @@
       <w:r>
         <w:rPr>
           <w:rFonts w:ascii="Cambria" w:hAnsi="Cambria"/>
+          <w:noProof/>
         </w:rPr>
         <w:drawing>
           <wp:inline distT="0" distB="0" distL="0" distR="0" wp14:anchorId="016D9723" wp14:editId="2F65F3CA">
@@ -1036,7 +1067,7 @@
                     <pic:cNvPicPr/>
                   </pic:nvPicPr>
                   <pic:blipFill>
-                    <a:blip r:embed="rId10"/>
+                    <a:blip r:embed="rId12"/>
                     <a:stretch>
                       <a:fillRect/>
                     </a:stretch>
@@ -1067,6 +1098,7 @@
       <w:r>
         <w:rPr>
           <w:rFonts w:ascii="Cambria" w:hAnsi="Cambria"/>
+          <w:noProof/>
         </w:rPr>
         <w:lastRenderedPageBreak/>
         <w:drawing>
@@ -1085,7 +1117,7 @@
                     <pic:cNvPicPr/>
                   </pic:nvPicPr>
                   <pic:blipFill>
-                    <a:blip r:embed="rId11"/>
+                    <a:blip r:embed="rId13"/>
                     <a:stretch>
                       <a:fillRect/>
                     </a:stretch>
@@ -1136,7 +1168,7 @@
                     </pic:cNvPicPr>
                   </pic:nvPicPr>
                   <pic:blipFill>
-                    <a:blip r:embed="rId12">
+                    <a:blip r:embed="rId14">
                       <a:extLst>
                         <a:ext uri="{28A0092B-C50C-407E-A947-70E740481C1C}">
                           <a14:useLocalDpi xmlns:a14="http://schemas.microsoft.com/office/drawing/2010/main" val="0"/>
@@ -1325,6 +1357,7 @@
       <w:r>
         <w:rPr>
           <w:rFonts w:ascii="Cambria" w:hAnsi="Cambria"/>
+          <w:noProof/>
         </w:rPr>
         <w:lastRenderedPageBreak/>
         <w:drawing>
@@ -1343,7 +1376,7 @@
                     <pic:cNvPicPr/>
                   </pic:nvPicPr>
                   <pic:blipFill>
-                    <a:blip r:embed="rId13"/>
+                    <a:blip r:embed="rId15"/>
                     <a:stretch>
                       <a:fillRect/>
                     </a:stretch>
@@ -1380,6 +1413,7 @@
       <w:r>
         <w:rPr>
           <w:rFonts w:ascii="Cambria" w:hAnsi="Cambria"/>
+          <w:noProof/>
         </w:rPr>
         <w:drawing>
           <wp:inline distT="0" distB="0" distL="0" distR="0" wp14:anchorId="72D06BDC" wp14:editId="3B1F721A">
@@ -1397,7 +1431,7 @@
                     <pic:cNvPicPr/>
                   </pic:nvPicPr>
                   <pic:blipFill>
-                    <a:blip r:embed="rId14"/>
+                    <a:blip r:embed="rId16"/>
                     <a:stretch>
                       <a:fillRect/>
                     </a:stretch>
@@ -1638,6 +1672,7 @@
       <w:r>
         <w:rPr>
           <w:rFonts w:ascii="Cambria" w:hAnsi="Cambria"/>
+          <w:noProof/>
         </w:rPr>
         <w:lastRenderedPageBreak/>
         <w:drawing>
@@ -1656,7 +1691,7 @@
                     <pic:cNvPicPr/>
                   </pic:nvPicPr>
                   <pic:blipFill>
-                    <a:blip r:embed="rId15"/>
+                    <a:blip r:embed="rId17"/>
                     <a:stretch>
                       <a:fillRect/>
                     </a:stretch>
@@ -1695,6 +1730,7 @@
       <w:r>
         <w:rPr>
           <w:rFonts w:ascii="Cambria" w:hAnsi="Cambria"/>
+          <w:noProof/>
         </w:rPr>
         <w:drawing>
           <wp:inline distT="0" distB="0" distL="0" distR="0" wp14:anchorId="5B74F4E9" wp14:editId="5E577FEE">
@@ -1712,7 +1748,7 @@
                     <pic:cNvPicPr/>
                   </pic:nvPicPr>
                   <pic:blipFill>
-                    <a:blip r:embed="rId16"/>
+                    <a:blip r:embed="rId18"/>
                     <a:stretch>
                       <a:fillRect/>
                     </a:stretch>
@@ -1743,6 +1779,7 @@
       <w:r>
         <w:rPr>
           <w:rFonts w:ascii="Cambria" w:hAnsi="Cambria"/>
+          <w:noProof/>
         </w:rPr>
         <w:lastRenderedPageBreak/>
         <w:drawing>
@@ -1761,7 +1798,7 @@
                     <pic:cNvPicPr/>
                   </pic:nvPicPr>
                   <pic:blipFill>
-                    <a:blip r:embed="rId17"/>
+                    <a:blip r:embed="rId19"/>
                     <a:stretch>
                       <a:fillRect/>
                     </a:stretch>
@@ -1938,6 +1975,7 @@
       <w:r>
         <w:rPr>
           <w:rFonts w:ascii="Cambria" w:hAnsi="Cambria"/>
+          <w:noProof/>
         </w:rPr>
         <w:drawing>
           <wp:inline distT="0" distB="0" distL="0" distR="0" wp14:anchorId="16F84CAF" wp14:editId="0B2CB399">
@@ -1955,7 +1993,7 @@
                     <pic:cNvPicPr/>
                   </pic:nvPicPr>
                   <pic:blipFill>
-                    <a:blip r:embed="rId18"/>
+                    <a:blip r:embed="rId20"/>
                     <a:stretch>
                       <a:fillRect/>
                     </a:stretch>
@@ -1986,6 +2024,7 @@
       <w:r>
         <w:rPr>
           <w:rFonts w:ascii="Cambria" w:hAnsi="Cambria"/>
+          <w:noProof/>
         </w:rPr>
         <w:lastRenderedPageBreak/>
         <w:drawing>
@@ -2004,7 +2043,7 @@
                     <pic:cNvPicPr/>
                   </pic:nvPicPr>
                   <pic:blipFill>
-                    <a:blip r:embed="rId19"/>
+                    <a:blip r:embed="rId21"/>
                     <a:stretch>
                       <a:fillRect/>
                     </a:stretch>
@@ -2035,6 +2074,7 @@
       <w:r>
         <w:rPr>
           <w:rFonts w:ascii="Cambria" w:hAnsi="Cambria"/>
+          <w:noProof/>
         </w:rPr>
         <w:lastRenderedPageBreak/>
         <w:drawing>
@@ -2053,7 +2093,7 @@
                     <pic:cNvPicPr/>
                   </pic:nvPicPr>
                   <pic:blipFill>
-                    <a:blip r:embed="rId20"/>
+                    <a:blip r:embed="rId22"/>
                     <a:stretch>
                       <a:fillRect/>
                     </a:stretch>
@@ -2610,21 +2650,7 @@
         <w:rPr>
           <w:rFonts w:ascii="Cambria" w:hAnsi="Cambria"/>
         </w:rPr>
-        <w:t xml:space="preserve">Hugging Face provides ready-to-use pre-trained vision models. These models can be loaded without training them from the beginning. It makes image-classification experimentation easier and faster. Different models can be </w:t>
-      </w:r>
-      <w:proofErr w:type="gramStart"/>
-      <w:r>
-        <w:rPr>
-          <w:rFonts w:ascii="Cambria" w:hAnsi="Cambria"/>
-        </w:rPr>
-        <w:t>tested</w:t>
-      </w:r>
-      <w:proofErr w:type="gramEnd"/>
-      <w:r>
-        <w:rPr>
-          <w:rFonts w:ascii="Cambria" w:hAnsi="Cambria"/>
-        </w:rPr>
-        <w:t xml:space="preserve"> and their predictions can be compared. Therefore, Hugging Face simplifies the development and evaluation of vision applications.</w:t>
+        <w:t>Hugging Face provides ready-to-use pre-trained vision models. These models can be loaded without training them from the beginning. It makes image-classification experimentation easier and faster. Different models can be tested and their predictions can be compared. Therefore, Hugging Face simplifies the development and evaluation of vision applications.</w:t>
       </w:r>
     </w:p>
     <w:p>
@@ -3312,6 +3338,7 @@
     </w:p>
     <w:p/>
     <w:sectPr>
+      <w:headerReference w:type="default" r:id="rId23"/>
       <w:pgSz w:w="11906" w:h="16838"/>
       <w:pgMar w:top="1440" w:right="1440" w:bottom="1440" w:left="1440" w:header="708" w:footer="708" w:gutter="0"/>
       <w:pgBorders w:offsetFrom="page">
@@ -3325,6 +3352,83 @@
     </w:sectPr>
   </w:body>
 </w:document>
+</file>
+
+<file path=word/endnotes.xml><?xml version="1.0" encoding="utf-8"?>
+<w:endnotes xmlns:wpc="http://schemas.microsoft.com/office/word/2010/wordprocessingCanvas" xmlns:cx="http://schemas.microsoft.com/office/drawing/2014/chartex" xmlns:cx1="http://schemas.microsoft.com/office/drawing/2015/9/8/chartex" xmlns:cx2="http://schemas.microsoft.com/office/drawing/2015/10/21/chartex" xmlns:cx3="http://schemas.microsoft.com/office/drawing/2016/5/9/chartex" xmlns:cx4="http://schemas.microsoft.com/office/drawing/2016/5/10/chartex" xmlns:cx5="http://schemas.microsoft.com/office/drawing/2016/5/11/chartex" xmlns:cx6="http://schemas.microsoft.com/office/drawing/2016/5/12/chartex" xmlns:cx7="http://schemas.microsoft.com/office/drawing/2016/5/13/chartex" xmlns:cx8="http://schemas.microsoft.com/office/drawing/2016/5/14/chartex" xmlns:mc="http://schemas.openxmlformats.org/markup-compatibility/2006" xmlns:aink="http://schemas.microsoft.com/office/drawing/2016/ink" xmlns:am3d="http://schemas.microsoft.com/office/drawing/2017/model3d" xmlns:o="urn:schemas-microsoft-com:office:office" xmlns:oel="http://schemas.microsoft.com/office/2019/extlst" xmlns:r="http://schemas.openxmlformats.org/officeDocument/2006/relationships" xmlns:m="http://schemas.openxmlformats.org/officeDocument/2006/math" xmlns:v="urn:schemas-microsoft-com:vml" xmlns:wp14="http://schemas.microsoft.com/office/word/2010/wordprocessingDrawing" xmlns:wp="http://schemas.openxmlformats.org/drawingml/2006/wordprocessingDrawing" xmlns:w10="urn:schemas-microsoft-com:office:word" xmlns:w="http://schemas.openxmlformats.org/wordprocessingml/2006/main" xmlns:w14="http://schemas.microsoft.com/office/word/2010/wordml" xmlns:w15="http://schemas.microsoft.com/office/word/2012/wordml" xmlns:w16cex="http://schemas.microsoft.com/office/word/2018/wordml/cex" xmlns:w16cid="http://schemas.microsoft.com/office/word/2016/wordml/cid" xmlns:w16="http://schemas.microsoft.com/office/word/2018/wordml" xmlns:w16du="http://schemas.microsoft.com/office/word/2023/wordml/word16du" xmlns:w16sdtdh="http://schemas.microsoft.com/office/word/2020/wordml/sdtdatahash" xmlns:w16sdtfl="http://schemas.microsoft.com/office/word/2024/wordml/sdtformatlock" xmlns:w16se="http://schemas.microsoft.com/office/word/2015/wordml/symex" xmlns:wpg="http://schemas.microsoft.com/office/word/2010/wordprocessingGroup" xmlns:wpi="http://schemas.microsoft.com/office/word/2010/wordprocessingInk" xmlns:wne="http://schemas.microsoft.com/office/word/2006/wordml" xmlns:wps="http://schemas.microsoft.com/office/word/2010/wordprocessingShape" mc:Ignorable="w14 w15 w16se w16cid w16 w16cex w16sdtdh w16sdtfl w16du wp14">
+  <w:endnote w:type="separator" w:id="-1">
+    <w:p>
+      <w:pPr>
+        <w:spacing w:after="0" w:line="240" w:lineRule="auto"/>
+      </w:pPr>
+      <w:r>
+        <w:separator/>
+      </w:r>
+    </w:p>
+  </w:endnote>
+  <w:endnote w:type="continuationSeparator" w:id="0">
+    <w:p>
+      <w:pPr>
+        <w:spacing w:after="0" w:line="240" w:lineRule="auto"/>
+      </w:pPr>
+      <w:r>
+        <w:continuationSeparator/>
+      </w:r>
+    </w:p>
+  </w:endnote>
+</w:endnotes>
+</file>
+
+<file path=word/footnotes.xml><?xml version="1.0" encoding="utf-8"?>
+<w:footnotes xmlns:wpc="http://schemas.microsoft.com/office/word/2010/wordprocessingCanvas" xmlns:cx="http://schemas.microsoft.com/office/drawing/2014/chartex" xmlns:cx1="http://schemas.microsoft.com/office/drawing/2015/9/8/chartex" xmlns:cx2="http://schemas.microsoft.com/office/drawing/2015/10/21/chartex" xmlns:cx3="http://schemas.microsoft.com/office/drawing/2016/5/9/chartex" xmlns:cx4="http://schemas.microsoft.com/office/drawing/2016/5/10/chartex" xmlns:cx5="http://schemas.microsoft.com/office/drawing/2016/5/11/chartex" xmlns:cx6="http://schemas.microsoft.com/office/drawing/2016/5/12/chartex" xmlns:cx7="http://schemas.microsoft.com/office/drawing/2016/5/13/chartex" xmlns:cx8="http://schemas.microsoft.com/office/drawing/2016/5/14/chartex" xmlns:mc="http://schemas.openxmlformats.org/markup-compatibility/2006" xmlns:aink="http://schemas.microsoft.com/office/drawing/2016/ink" xmlns:am3d="http://schemas.microsoft.com/office/drawing/2017/model3d" xmlns:o="urn:schemas-microsoft-com:office:office" xmlns:oel="http://schemas.microsoft.com/office/2019/extlst" xmlns:r="http://schemas.openxmlformats.org/officeDocument/2006/relationships" xmlns:m="http://schemas.openxmlformats.org/officeDocument/2006/math" xmlns:v="urn:schemas-microsoft-com:vml" xmlns:wp14="http://schemas.microsoft.com/office/word/2010/wordprocessingDrawing" xmlns:wp="http://schemas.openxmlformats.org/drawingml/2006/wordprocessingDrawing" xmlns:w10="urn:schemas-microsoft-com:office:word" xmlns:w="http://schemas.openxmlformats.org/wordprocessingml/2006/main" xmlns:w14="http://schemas.microsoft.com/office/word/2010/wordml" xmlns:w15="http://schemas.microsoft.com/office/word/2012/wordml" xmlns:w16cex="http://schemas.microsoft.com/office/word/2018/wordml/cex" xmlns:w16cid="http://schemas.microsoft.com/office/word/2016/wordml/cid" xmlns:w16="http://schemas.microsoft.com/office/word/2018/wordml" xmlns:w16du="http://schemas.microsoft.com/office/word/2023/wordml/word16du" xmlns:w16sdtdh="http://schemas.microsoft.com/office/word/2020/wordml/sdtdatahash" xmlns:w16sdtfl="http://schemas.microsoft.com/office/word/2024/wordml/sdtformatlock" xmlns:w16se="http://schemas.microsoft.com/office/word/2015/wordml/symex" xmlns:wpg="http://schemas.microsoft.com/office/word/2010/wordprocessingGroup" xmlns:wpi="http://schemas.microsoft.com/office/word/2010/wordprocessingInk" xmlns:wne="http://schemas.microsoft.com/office/word/2006/wordml" xmlns:wps="http://schemas.microsoft.com/office/word/2010/wordprocessingShape" mc:Ignorable="w14 w15 w16se w16cid w16 w16cex w16sdtdh w16sdtfl w16du wp14">
+  <w:footnote w:type="separator" w:id="-1">
+    <w:p>
+      <w:pPr>
+        <w:spacing w:after="0" w:line="240" w:lineRule="auto"/>
+      </w:pPr>
+      <w:r>
+        <w:separator/>
+      </w:r>
+    </w:p>
+  </w:footnote>
+  <w:footnote w:type="continuationSeparator" w:id="0">
+    <w:p>
+      <w:pPr>
+        <w:spacing w:after="0" w:line="240" w:lineRule="auto"/>
+      </w:pPr>
+      <w:r>
+        <w:continuationSeparator/>
+      </w:r>
+    </w:p>
+  </w:footnote>
+</w:footnotes>
+</file>
+
+<file path=word/header1.xml><?xml version="1.0" encoding="utf-8"?>
+<w:hdr xmlns:wpc="http://schemas.microsoft.com/office/word/2010/wordprocessingCanvas" xmlns:cx="http://schemas.microsoft.com/office/drawing/2014/chartex" xmlns:cx1="http://schemas.microsoft.com/office/drawing/2015/9/8/chartex" xmlns:cx2="http://schemas.microsoft.com/office/drawing/2015/10/21/chartex" xmlns:cx3="http://schemas.microsoft.com/office/drawing/2016/5/9/chartex" xmlns:cx4="http://schemas.microsoft.com/office/drawing/2016/5/10/chartex" xmlns:cx5="http://schemas.microsoft.com/office/drawing/2016/5/11/chartex" xmlns:cx6="http://schemas.microsoft.com/office/drawing/2016/5/12/chartex" xmlns:cx7="http://schemas.microsoft.com/office/drawing/2016/5/13/chartex" xmlns:cx8="http://schemas.microsoft.com/office/drawing/2016/5/14/chartex" xmlns:mc="http://schemas.openxmlformats.org/markup-compatibility/2006" xmlns:aink="http://schemas.microsoft.com/office/drawing/2016/ink" xmlns:am3d="http://schemas.microsoft.com/office/drawing/2017/model3d" xmlns:o="urn:schemas-microsoft-com:office:office" xmlns:oel="http://schemas.microsoft.com/office/2019/extlst" xmlns:r="http://schemas.openxmlformats.org/officeDocument/2006/relationships" xmlns:m="http://schemas.openxmlformats.org/officeDocument/2006/math" xmlns:v="urn:schemas-microsoft-com:vml" xmlns:wp14="http://schemas.microsoft.com/office/word/2010/wordprocessingDrawing" xmlns:wp="http://schemas.openxmlformats.org/drawingml/2006/wordprocessingDrawing" xmlns:w10="urn:schemas-microsoft-com:office:word" xmlns:w="http://schemas.openxmlformats.org/wordprocessingml/2006/main" xmlns:w14="http://schemas.microsoft.com/office/word/2010/wordml" xmlns:w15="http://schemas.microsoft.com/office/word/2012/wordml" xmlns:w16cex="http://schemas.microsoft.com/office/word/2018/wordml/cex" xmlns:w16cid="http://schemas.microsoft.com/office/word/2016/wordml/cid" xmlns:w16="http://schemas.microsoft.com/office/word/2018/wordml" xmlns:w16du="http://schemas.microsoft.com/office/word/2023/wordml/word16du" xmlns:w16sdtdh="http://schemas.microsoft.com/office/word/2020/wordml/sdtdatahash" xmlns:w16sdtfl="http://schemas.microsoft.com/office/word/2024/wordml/sdtformatlock" xmlns:w16se="http://schemas.microsoft.com/office/word/2015/wordml/symex" xmlns:wpg="http://schemas.microsoft.com/office/word/2010/wordprocessingGroup" xmlns:wpi="http://schemas.microsoft.com/office/word/2010/wordprocessingInk" xmlns:wne="http://schemas.microsoft.com/office/word/2006/wordml" xmlns:wps="http://schemas.microsoft.com/office/word/2010/wordprocessingShape" mc:Ignorable="w14 w15 w16se w16cid w16 w16cex w16sdtdh w16sdtfl w16du wp14">
+  <w:p>
+    <w:pPr>
+      <w:pStyle w:val="Header"/>
+      <w:rPr>
+        <w:lang w:val="en-GB"/>
+      </w:rPr>
+    </w:pPr>
+    <w:r>
+      <w:rPr>
+        <w:lang w:val="en-GB"/>
+      </w:rPr>
+      <w:t>Midhun P 24BAD069</w:t>
+    </w:r>
+  </w:p>
+  <w:p>
+    <w:pPr>
+      <w:pStyle w:val="Header"/>
+      <w:rPr>
+        <w:lang w:val="en-GB"/>
+      </w:rPr>
+    </w:pPr>
+  </w:p>
+</w:hdr>
 </file>
 
 <file path=word/numbering.xml><?xml version="1.0" encoding="utf-8"?>
@@ -9834,6 +9938,7 @@
   <w:style w:type="character" w:default="1" w:styleId="DefaultParagraphFont">
     <w:name w:val="Default Paragraph Font"/>
     <w:uiPriority w:val="1"/>
+    <w:semiHidden/>
     <w:unhideWhenUsed/>
   </w:style>
   <w:style w:type="table" w:default="1" w:styleId="TableNormal">
@@ -10234,6 +10339,58 @@
       <w:shd w:val="clear" w:color="auto" w:fill="E1DFDD"/>
     </w:rPr>
   </w:style>
+  <w:style w:type="paragraph" w:styleId="Header">
+    <w:name w:val="header"/>
+    <w:basedOn w:val="Normal"/>
+    <w:link w:val="HeaderChar"/>
+    <w:uiPriority w:val="99"/>
+    <w:unhideWhenUsed/>
+    <w:rsid w:val="00C14BB0"/>
+    <w:pPr>
+      <w:tabs>
+        <w:tab w:val="center" w:pos="4513"/>
+        <w:tab w:val="right" w:pos="9026"/>
+      </w:tabs>
+      <w:spacing w:after="0" w:line="240" w:lineRule="auto"/>
+    </w:pPr>
+  </w:style>
+  <w:style w:type="character" w:customStyle="1" w:styleId="HeaderChar">
+    <w:name w:val="Header Char"/>
+    <w:basedOn w:val="DefaultParagraphFont"/>
+    <w:link w:val="Header"/>
+    <w:uiPriority w:val="99"/>
+    <w:rsid w:val="00C14BB0"/>
+    <w:rPr>
+      <w:kern w:val="0"/>
+      <w14:ligatures w14:val="none"/>
+    </w:rPr>
+  </w:style>
+  <w:style w:type="paragraph" w:styleId="Footer">
+    <w:name w:val="footer"/>
+    <w:basedOn w:val="Normal"/>
+    <w:link w:val="FooterChar"/>
+    <w:uiPriority w:val="99"/>
+    <w:unhideWhenUsed/>
+    <w:rsid w:val="00C14BB0"/>
+    <w:pPr>
+      <w:tabs>
+        <w:tab w:val="center" w:pos="4513"/>
+        <w:tab w:val="right" w:pos="9026"/>
+      </w:tabs>
+      <w:spacing w:after="0" w:line="240" w:lineRule="auto"/>
+    </w:pPr>
+  </w:style>
+  <w:style w:type="character" w:customStyle="1" w:styleId="FooterChar">
+    <w:name w:val="Footer Char"/>
+    <w:basedOn w:val="DefaultParagraphFont"/>
+    <w:link w:val="Footer"/>
+    <w:uiPriority w:val="99"/>
+    <w:rsid w:val="00C14BB0"/>
+    <w:rPr>
+      <w:kern w:val="0"/>
+      <w14:ligatures w14:val="none"/>
+    </w:rPr>
+  </w:style>
 </w:styles>
 </file>
 
@@ -10533,20 +10690,20 @@
 </file>
 
 <file path=customXml/item1.xml><?xml version="1.0" encoding="utf-8"?>
-<p:properties xmlns:p="http://schemas.microsoft.com/office/2006/metadata/properties" xmlns:xsi="http://www.w3.org/2001/XMLSchema-instance" xmlns:pc="http://schemas.microsoft.com/office/infopath/2007/PartnerControls">
-  <documentManagement>
-    <ReferenceId xmlns="52e475d0-7a59-4bc0-9cc0-fcd49de06a14" xsi:nil="true"/>
-  </documentManagement>
-</p:properties>
-</file>
-
-<file path=customXml/item2.xml><?xml version="1.0" encoding="utf-8"?>
 <?mso-contentType ?>
 <FormTemplates xmlns="http://schemas.microsoft.com/sharepoint/v3/contenttype/forms">
   <Display>DocumentLibraryForm</Display>
   <Edit>DocumentLibraryForm</Edit>
   <New>DocumentLibraryForm</New>
 </FormTemplates>
+</file>
+
+<file path=customXml/item2.xml><?xml version="1.0" encoding="utf-8"?>
+<p:properties xmlns:p="http://schemas.microsoft.com/office/2006/metadata/properties" xmlns:xsi="http://www.w3.org/2001/XMLSchema-instance" xmlns:pc="http://schemas.microsoft.com/office/infopath/2007/PartnerControls">
+  <documentManagement>
+    <ReferenceId xmlns="52e475d0-7a59-4bc0-9cc0-fcd49de06a14" xsi:nil="true"/>
+  </documentManagement>
+</p:properties>
 </file>
 
 <file path=customXml/item3.xml><?xml version="1.0" encoding="utf-8"?>
@@ -10694,19 +10851,19 @@
 </file>
 
 <file path=customXml/itemProps1.xml><?xml version="1.0" encoding="utf-8"?>
+<ds:datastoreItem xmlns:ds="http://schemas.openxmlformats.org/officeDocument/2006/customXml" ds:itemID="{A2B7FEAD-D71D-4B57-AAC5-99F834A2A114}">
+  <ds:schemaRefs>
+    <ds:schemaRef ds:uri="http://schemas.microsoft.com/sharepoint/v3/contenttype/forms"/>
+  </ds:schemaRefs>
+</ds:datastoreItem>
+</file>
+
+<file path=customXml/itemProps2.xml><?xml version="1.0" encoding="utf-8"?>
 <ds:datastoreItem xmlns:ds="http://schemas.openxmlformats.org/officeDocument/2006/customXml" ds:itemID="{A95A0202-7989-49A9-833A-EED91318D47A}">
   <ds:schemaRefs>
     <ds:schemaRef ds:uri="http://schemas.microsoft.com/office/2006/metadata/properties"/>
     <ds:schemaRef ds:uri="http://schemas.microsoft.com/office/infopath/2007/PartnerControls"/>
     <ds:schemaRef ds:uri="52e475d0-7a59-4bc0-9cc0-fcd49de06a14"/>
-  </ds:schemaRefs>
-</ds:datastoreItem>
-</file>
-
-<file path=customXml/itemProps2.xml><?xml version="1.0" encoding="utf-8"?>
-<ds:datastoreItem xmlns:ds="http://schemas.openxmlformats.org/officeDocument/2006/customXml" ds:itemID="{A2B7FEAD-D71D-4B57-AAC5-99F834A2A114}">
-  <ds:schemaRefs>
-    <ds:schemaRef ds:uri="http://schemas.microsoft.com/sharepoint/v3/contenttype/forms"/>
   </ds:schemaRefs>
 </ds:datastoreItem>
 </file>

</xml_diff>